<commit_message>
Add extra actvities and slide presentation
</commit_message>
<xml_diff>
--- a/Cheatsheet.docx
+++ b/Cheatsheet.docx
@@ -432,18 +432,7 @@
           <w:szCs w:val="25"/>
           <w:lang w:val="en-US"/>
         </w:rPr>
-        <w:t>- Authenthication means username and</w:t>
-      </w:r>
-      <w:bookmarkStart w:id="0" w:name="_GoBack"/>
-      <w:bookmarkEnd w:id="0"/>
-      <w:r>
-        <w:rPr>
-          <w:rFonts w:hint="default" w:ascii="Times New Roman" w:hAnsi="Times New Roman" w:cs="Times New Roman"/>
-          <w:sz w:val="25"/>
-          <w:szCs w:val="25"/>
-          <w:lang w:val="en-US"/>
-        </w:rPr>
-        <w:t xml:space="preserve"> password =&gt; Like ID</w:t>
+        <w:t>- Authenthication means username and password =&gt; Like ID</w:t>
       </w:r>
     </w:p>
     <w:p>
@@ -495,6 +484,14 @@
         </w:numPr>
         <w:ind w:left="0" w:leftChars="0" w:firstLine="0" w:firstLineChars="0"/>
         <w:jc w:val="both"/>
+        <w:rPr>
+          <w:rFonts w:hint="default" w:ascii="Times New Roman" w:hAnsi="Times New Roman" w:eastAsia="SimSun" w:cs="Times New Roman"/>
+          <w:sz w:val="24"/>
+          <w:szCs w:val="24"/>
+          <w:lang w:val="en-US"/>
+        </w:rPr>
+      </w:pPr>
+      <w:r>
         <w:rPr>
           <w:rFonts w:hint="default" w:ascii="Times New Roman" w:hAnsi="Times New Roman" w:cs="Times New Roman"/>
           <w:b/>
@@ -505,10 +502,42 @@
           <w:szCs w:val="28"/>
           <w:lang w:val="en-US"/>
         </w:rPr>
-      </w:pPr>
-      <w:r>
-        <w:rPr>
-          <w:rFonts w:hint="default" w:ascii="Times New Roman" w:hAnsi="Times New Roman" w:cs="Times New Roman"/>
+        <w:t xml:space="preserve">Tacit Requirement: </w:t>
+      </w:r>
+      <w:r>
+        <w:rPr>
+          <w:rFonts w:hint="default" w:ascii="Times New Roman" w:hAnsi="Times New Roman" w:eastAsia="SimSun" w:cs="Times New Roman"/>
+          <w:sz w:val="24"/>
+          <w:szCs w:val="24"/>
+        </w:rPr>
+        <w:t>unstated, hidden, or embedded expectations that users assume are universally understood.</w:t>
+      </w:r>
+    </w:p>
+    <w:p>
+      <w:pPr>
+        <w:numPr>
+          <w:numId w:val="0"/>
+        </w:numPr>
+        <w:ind w:leftChars="0"/>
+        <w:jc w:val="both"/>
+        <w:rPr>
+          <w:rFonts w:hint="default" w:ascii="Times New Roman" w:hAnsi="Times New Roman" w:eastAsia="SimSun" w:cs="Times New Roman"/>
+          <w:sz w:val="24"/>
+          <w:szCs w:val="24"/>
+          <w:lang w:val="en-US"/>
+        </w:rPr>
+      </w:pPr>
+    </w:p>
+    <w:p>
+      <w:pPr>
+        <w:numPr>
+          <w:ilvl w:val="0"/>
+          <w:numId w:val="1"/>
+        </w:numPr>
+        <w:ind w:left="0" w:leftChars="0" w:firstLine="0" w:firstLineChars="0"/>
+        <w:jc w:val="both"/>
+        <w:rPr>
+          <w:rFonts w:hint="default" w:ascii="Times New Roman" w:hAnsi="Times New Roman" w:eastAsia="SimSun" w:cs="Times New Roman"/>
           <w:b/>
           <w:bCs/>
           <w:i/>
@@ -517,16 +546,597 @@
           <w:szCs w:val="28"/>
           <w:lang w:val="en-US"/>
         </w:rPr>
-        <w:t xml:space="preserve">Tacit Requirement: </w:t>
-      </w:r>
-      <w:r>
-        <w:rPr>
-          <w:rFonts w:hint="default" w:ascii="Times New Roman" w:hAnsi="Times New Roman" w:eastAsia="SimSun" w:cs="Times New Roman"/>
-          <w:sz w:val="24"/>
-          <w:szCs w:val="24"/>
-        </w:rPr>
-        <w:t>unstated, hidden, or embedded expectations that users assume are universally understood.</w:t>
-      </w:r>
+      </w:pPr>
+      <w:r>
+        <w:rPr>
+          <w:rFonts w:hint="default" w:ascii="Times New Roman" w:hAnsi="Times New Roman" w:eastAsia="SimSun" w:cs="Times New Roman"/>
+          <w:b/>
+          <w:bCs/>
+          <w:i/>
+          <w:iCs/>
+          <w:sz w:val="28"/>
+          <w:szCs w:val="28"/>
+          <w:lang w:val="en-US"/>
+        </w:rPr>
+        <w:t xml:space="preserve">Hierachical Quality Model: </w:t>
+      </w:r>
+    </w:p>
+    <w:p>
+      <w:pPr>
+        <w:numPr>
+          <w:numId w:val="0"/>
+        </w:numPr>
+        <w:ind w:leftChars="0" w:firstLine="420" w:firstLineChars="150"/>
+        <w:jc w:val="both"/>
+        <w:rPr>
+          <w:rFonts w:hint="default" w:ascii="Times New Roman" w:hAnsi="Times New Roman" w:eastAsia="SimSun" w:cs="Times New Roman"/>
+          <w:b w:val="0"/>
+          <w:bCs w:val="0"/>
+          <w:i w:val="0"/>
+          <w:iCs w:val="0"/>
+          <w:sz w:val="28"/>
+          <w:szCs w:val="28"/>
+          <w:lang w:val="en-US"/>
+        </w:rPr>
+      </w:pPr>
+      <w:r>
+        <w:rPr>
+          <w:rFonts w:hint="default" w:ascii="Times New Roman" w:hAnsi="Times New Roman" w:eastAsia="SimSun" w:cs="Times New Roman"/>
+          <w:b w:val="0"/>
+          <w:bCs w:val="0"/>
+          <w:i w:val="0"/>
+          <w:iCs w:val="0"/>
+          <w:sz w:val="28"/>
+          <w:szCs w:val="28"/>
+          <w:lang w:val="en-US"/>
+        </w:rPr>
+        <w:t>* Availability: is the system providing the service it is supposed to when it is expected to?</w:t>
+      </w:r>
+    </w:p>
+    <w:p>
+      <w:pPr>
+        <w:numPr>
+          <w:numId w:val="0"/>
+        </w:numPr>
+        <w:ind w:leftChars="0" w:firstLine="420" w:firstLineChars="150"/>
+        <w:jc w:val="both"/>
+        <w:rPr>
+          <w:rFonts w:hint="default" w:ascii="Times New Roman" w:hAnsi="Times New Roman" w:eastAsia="SimSun" w:cs="Times New Roman"/>
+          <w:b w:val="0"/>
+          <w:bCs w:val="0"/>
+          <w:i w:val="0"/>
+          <w:iCs w:val="0"/>
+          <w:sz w:val="28"/>
+          <w:szCs w:val="28"/>
+          <w:lang w:val="en-US"/>
+        </w:rPr>
+      </w:pPr>
+      <w:r>
+        <w:rPr>
+          <w:rFonts w:hint="default" w:ascii="Times New Roman" w:hAnsi="Times New Roman" w:eastAsia="SimSun" w:cs="Times New Roman"/>
+          <w:b w:val="0"/>
+          <w:bCs w:val="0"/>
+          <w:i w:val="0"/>
+          <w:iCs w:val="0"/>
+          <w:sz w:val="28"/>
+          <w:szCs w:val="28"/>
+          <w:lang w:val="en-US"/>
+        </w:rPr>
+        <w:t>* Modifiability: can reasonable changes be made at reasonable cost?</w:t>
+      </w:r>
+    </w:p>
+    <w:p>
+      <w:pPr>
+        <w:numPr>
+          <w:numId w:val="0"/>
+        </w:numPr>
+        <w:ind w:leftChars="0" w:firstLine="420" w:firstLineChars="150"/>
+        <w:jc w:val="both"/>
+        <w:rPr>
+          <w:rFonts w:hint="default" w:ascii="Times New Roman" w:hAnsi="Times New Roman" w:eastAsia="SimSun" w:cs="Times New Roman"/>
+          <w:b w:val="0"/>
+          <w:bCs w:val="0"/>
+          <w:i w:val="0"/>
+          <w:iCs w:val="0"/>
+          <w:sz w:val="28"/>
+          <w:szCs w:val="28"/>
+          <w:lang w:val="en-US"/>
+        </w:rPr>
+      </w:pPr>
+      <w:r>
+        <w:rPr>
+          <w:rFonts w:hint="default" w:ascii="Times New Roman" w:hAnsi="Times New Roman" w:eastAsia="SimSun" w:cs="Times New Roman"/>
+          <w:b w:val="0"/>
+          <w:bCs w:val="0"/>
+          <w:i w:val="0"/>
+          <w:iCs w:val="0"/>
+          <w:sz w:val="28"/>
+          <w:szCs w:val="28"/>
+          <w:lang w:val="en-US"/>
+        </w:rPr>
+        <w:t>* Performance: does the system respond quickly enough to user input?</w:t>
+      </w:r>
+    </w:p>
+    <w:p>
+      <w:pPr>
+        <w:numPr>
+          <w:numId w:val="0"/>
+        </w:numPr>
+        <w:ind w:leftChars="0" w:firstLine="420" w:firstLineChars="150"/>
+        <w:jc w:val="both"/>
+        <w:rPr>
+          <w:rFonts w:hint="default" w:ascii="Times New Roman" w:hAnsi="Times New Roman" w:eastAsia="SimSun" w:cs="Times New Roman"/>
+          <w:b w:val="0"/>
+          <w:bCs w:val="0"/>
+          <w:i w:val="0"/>
+          <w:iCs w:val="0"/>
+          <w:sz w:val="28"/>
+          <w:szCs w:val="28"/>
+          <w:lang w:val="en-US"/>
+        </w:rPr>
+      </w:pPr>
+      <w:r>
+        <w:rPr>
+          <w:rFonts w:hint="default" w:ascii="Times New Roman" w:hAnsi="Times New Roman" w:eastAsia="SimSun" w:cs="Times New Roman"/>
+          <w:b w:val="0"/>
+          <w:bCs w:val="0"/>
+          <w:i w:val="0"/>
+          <w:iCs w:val="0"/>
+          <w:sz w:val="28"/>
+          <w:szCs w:val="28"/>
+          <w:lang w:val="en-US"/>
+        </w:rPr>
+        <w:t>* Security: can authorized users access the services of the system while unauthorized people cannot?</w:t>
+      </w:r>
+    </w:p>
+    <w:p>
+      <w:pPr>
+        <w:numPr>
+          <w:numId w:val="0"/>
+        </w:numPr>
+        <w:ind w:leftChars="0" w:firstLine="420" w:firstLineChars="150"/>
+        <w:jc w:val="both"/>
+        <w:rPr>
+          <w:rFonts w:hint="default" w:ascii="Times New Roman" w:hAnsi="Times New Roman" w:eastAsia="SimSun" w:cs="Times New Roman"/>
+          <w:b w:val="0"/>
+          <w:bCs w:val="0"/>
+          <w:i w:val="0"/>
+          <w:iCs w:val="0"/>
+          <w:sz w:val="28"/>
+          <w:szCs w:val="28"/>
+          <w:lang w:val="en-US"/>
+        </w:rPr>
+      </w:pPr>
+      <w:r>
+        <w:rPr>
+          <w:rFonts w:hint="default" w:ascii="Times New Roman" w:hAnsi="Times New Roman" w:eastAsia="SimSun" w:cs="Times New Roman"/>
+          <w:b w:val="0"/>
+          <w:bCs w:val="0"/>
+          <w:i w:val="0"/>
+          <w:iCs w:val="0"/>
+          <w:sz w:val="28"/>
+          <w:szCs w:val="28"/>
+          <w:lang w:val="en-US"/>
+        </w:rPr>
+        <w:t>* Testability: can the system be exercised to a degree that ensures confidence in correctness?</w:t>
+      </w:r>
+    </w:p>
+    <w:p>
+      <w:pPr>
+        <w:numPr>
+          <w:numId w:val="0"/>
+        </w:numPr>
+        <w:ind w:leftChars="0" w:firstLine="420" w:firstLineChars="150"/>
+        <w:jc w:val="both"/>
+        <w:rPr>
+          <w:rFonts w:hint="default" w:ascii="Times New Roman" w:hAnsi="Times New Roman" w:eastAsia="SimSun" w:cs="Times New Roman"/>
+          <w:b w:val="0"/>
+          <w:bCs w:val="0"/>
+          <w:i w:val="0"/>
+          <w:iCs w:val="0"/>
+          <w:sz w:val="28"/>
+          <w:szCs w:val="28"/>
+          <w:lang w:val="en-US"/>
+        </w:rPr>
+      </w:pPr>
+      <w:r>
+        <w:rPr>
+          <w:rFonts w:hint="default" w:ascii="Times New Roman" w:hAnsi="Times New Roman" w:eastAsia="SimSun" w:cs="Times New Roman"/>
+          <w:b w:val="0"/>
+          <w:bCs w:val="0"/>
+          <w:i w:val="0"/>
+          <w:iCs w:val="0"/>
+          <w:sz w:val="28"/>
+          <w:szCs w:val="28"/>
+          <w:lang w:val="en-US"/>
+        </w:rPr>
+        <w:t>* Usability: how easy is it for the user to do what is desired?</w:t>
+      </w:r>
+    </w:p>
+    <w:p>
+      <w:pPr>
+        <w:numPr>
+          <w:numId w:val="0"/>
+        </w:numPr>
+        <w:ind w:leftChars="0" w:firstLine="420" w:firstLineChars="150"/>
+        <w:jc w:val="both"/>
+        <w:rPr>
+          <w:rFonts w:hint="default" w:ascii="Times New Roman" w:hAnsi="Times New Roman" w:eastAsia="SimSun" w:cs="Times New Roman"/>
+          <w:b w:val="0"/>
+          <w:bCs w:val="0"/>
+          <w:i w:val="0"/>
+          <w:iCs w:val="0"/>
+          <w:sz w:val="28"/>
+          <w:szCs w:val="28"/>
+          <w:lang w:val="en-US"/>
+        </w:rPr>
+      </w:pPr>
+      <w:r>
+        <w:rPr>
+          <w:rFonts w:hint="default" w:ascii="Times New Roman" w:hAnsi="Times New Roman" w:eastAsia="SimSun" w:cs="Times New Roman"/>
+          <w:b w:val="0"/>
+          <w:bCs w:val="0"/>
+          <w:i w:val="0"/>
+          <w:iCs w:val="0"/>
+          <w:sz w:val="28"/>
+          <w:szCs w:val="28"/>
+          <w:lang w:val="en-US"/>
+        </w:rPr>
+        <w:t>* Probability: the system must be changed to run on different hardware/operating system =&gt; modifiability</w:t>
+      </w:r>
+    </w:p>
+    <w:p>
+      <w:pPr>
+        <w:numPr>
+          <w:numId w:val="0"/>
+        </w:numPr>
+        <w:ind w:leftChars="0" w:firstLine="420" w:firstLineChars="150"/>
+        <w:jc w:val="both"/>
+        <w:rPr>
+          <w:rFonts w:hint="default" w:ascii="Times New Roman" w:hAnsi="Times New Roman" w:eastAsia="SimSun" w:cs="Times New Roman"/>
+          <w:b w:val="0"/>
+          <w:bCs w:val="0"/>
+          <w:i w:val="0"/>
+          <w:iCs w:val="0"/>
+          <w:sz w:val="28"/>
+          <w:szCs w:val="28"/>
+          <w:lang w:val="en-US"/>
+        </w:rPr>
+      </w:pPr>
+      <w:r>
+        <w:rPr>
+          <w:rFonts w:hint="default" w:ascii="Times New Roman" w:hAnsi="Times New Roman" w:eastAsia="SimSun" w:cs="Times New Roman"/>
+          <w:b w:val="0"/>
+          <w:bCs w:val="0"/>
+          <w:i w:val="0"/>
+          <w:iCs w:val="0"/>
+          <w:sz w:val="28"/>
+          <w:szCs w:val="28"/>
+          <w:lang w:val="en-US"/>
+        </w:rPr>
+        <w:t>* Maintainability (“fixing bugs”): the system must be changed to remove invalid/wrong behavior =&gt; modifiability</w:t>
+      </w:r>
+    </w:p>
+    <w:p>
+      <w:pPr>
+        <w:numPr>
+          <w:numId w:val="0"/>
+        </w:numPr>
+        <w:ind w:leftChars="0" w:firstLine="420" w:firstLineChars="150"/>
+        <w:jc w:val="both"/>
+        <w:rPr>
+          <w:rFonts w:hint="default" w:ascii="Times New Roman" w:hAnsi="Times New Roman" w:eastAsia="SimSun" w:cs="Times New Roman"/>
+          <w:b w:val="0"/>
+          <w:bCs w:val="0"/>
+          <w:i w:val="0"/>
+          <w:iCs w:val="0"/>
+          <w:sz w:val="28"/>
+          <w:szCs w:val="28"/>
+          <w:lang w:val="en-US"/>
+        </w:rPr>
+      </w:pPr>
+      <w:r>
+        <w:rPr>
+          <w:rFonts w:hint="default" w:ascii="Times New Roman" w:hAnsi="Times New Roman" w:eastAsia="SimSun" w:cs="Times New Roman"/>
+          <w:b w:val="0"/>
+          <w:bCs w:val="0"/>
+          <w:i w:val="0"/>
+          <w:iCs w:val="0"/>
+          <w:sz w:val="28"/>
+          <w:szCs w:val="28"/>
+          <w:lang w:val="en-US"/>
+        </w:rPr>
+        <w:t>* Scalability: the system must be changed to have more  capacity (can handle more requests than currently, store more information, etc.) =&gt; modifiability</w:t>
+      </w:r>
+    </w:p>
+    <w:p>
+      <w:pPr>
+        <w:numPr>
+          <w:numId w:val="0"/>
+        </w:numPr>
+        <w:ind w:leftChars="0" w:firstLine="420" w:firstLineChars="150"/>
+        <w:jc w:val="both"/>
+        <w:rPr>
+          <w:rFonts w:hint="default" w:ascii="Times New Roman" w:hAnsi="Times New Roman" w:eastAsia="SimSun" w:cs="Times New Roman"/>
+          <w:b w:val="0"/>
+          <w:bCs w:val="0"/>
+          <w:i w:val="0"/>
+          <w:iCs w:val="0"/>
+          <w:sz w:val="28"/>
+          <w:szCs w:val="28"/>
+          <w:lang w:val="en-US"/>
+        </w:rPr>
+      </w:pPr>
+      <w:r>
+        <w:rPr>
+          <w:rFonts w:hint="default" w:ascii="Times New Roman" w:hAnsi="Times New Roman" w:eastAsia="SimSun" w:cs="Times New Roman"/>
+          <w:b w:val="0"/>
+          <w:bCs w:val="0"/>
+          <w:i w:val="0"/>
+          <w:iCs w:val="0"/>
+          <w:sz w:val="28"/>
+          <w:szCs w:val="28"/>
+          <w:lang w:val="en-US"/>
+        </w:rPr>
+        <w:t>* Operability: the system must be “easy” to use, being  “easy” to learn etc. =&gt; usability</w:t>
+      </w:r>
+    </w:p>
+    <w:p>
+      <w:pPr>
+        <w:numPr>
+          <w:numId w:val="0"/>
+        </w:numPr>
+        <w:ind w:leftChars="0" w:firstLine="420" w:firstLineChars="150"/>
+        <w:jc w:val="both"/>
+        <w:rPr>
+          <w:rFonts w:hint="default" w:ascii="Times New Roman" w:hAnsi="Times New Roman" w:eastAsia="SimSun" w:cs="Times New Roman"/>
+          <w:b w:val="0"/>
+          <w:bCs w:val="0"/>
+          <w:i w:val="0"/>
+          <w:iCs w:val="0"/>
+          <w:sz w:val="28"/>
+          <w:szCs w:val="28"/>
+          <w:lang w:val="en-US"/>
+        </w:rPr>
+      </w:pPr>
+      <w:r>
+        <w:rPr>
+          <w:rFonts w:hint="default" w:ascii="Times New Roman" w:hAnsi="Times New Roman" w:eastAsia="SimSun" w:cs="Times New Roman"/>
+          <w:b w:val="0"/>
+          <w:bCs w:val="0"/>
+          <w:i w:val="0"/>
+          <w:iCs w:val="0"/>
+          <w:sz w:val="28"/>
+          <w:szCs w:val="28"/>
+          <w:lang w:val="en-US"/>
+        </w:rPr>
+        <w:t>* Reliability: the system must not fail “too often” =&gt; availability</w:t>
+      </w:r>
+    </w:p>
+    <w:p>
+      <w:pPr>
+        <w:numPr>
+          <w:numId w:val="0"/>
+        </w:numPr>
+        <w:ind w:leftChars="0" w:firstLine="420" w:firstLineChars="150"/>
+        <w:jc w:val="both"/>
+        <w:rPr>
+          <w:rFonts w:hint="default" w:ascii="Times New Roman" w:hAnsi="Times New Roman" w:eastAsia="SimSun" w:cs="Times New Roman"/>
+          <w:b w:val="0"/>
+          <w:bCs w:val="0"/>
+          <w:i w:val="0"/>
+          <w:iCs w:val="0"/>
+          <w:sz w:val="28"/>
+          <w:szCs w:val="28"/>
+          <w:lang w:val="en-US"/>
+        </w:rPr>
+      </w:pPr>
+      <w:r>
+        <w:rPr>
+          <w:rFonts w:hint="default" w:ascii="Times New Roman" w:hAnsi="Times New Roman" w:eastAsia="SimSun" w:cs="Times New Roman"/>
+          <w:b w:val="0"/>
+          <w:bCs w:val="0"/>
+          <w:i w:val="0"/>
+          <w:iCs w:val="0"/>
+          <w:sz w:val="28"/>
+          <w:szCs w:val="28"/>
+          <w:lang w:val="en-US"/>
+        </w:rPr>
+        <w:t>* Integrity: data of the system cannot be changed in an unauthorized manner =&gt; security</w:t>
+      </w:r>
+    </w:p>
+    <w:p>
+      <w:pPr>
+        <w:numPr>
+          <w:numId w:val="0"/>
+        </w:numPr>
+        <w:ind w:leftChars="0" w:firstLine="420" w:firstLineChars="150"/>
+        <w:jc w:val="both"/>
+        <w:rPr>
+          <w:rFonts w:hint="default" w:ascii="Times New Roman" w:hAnsi="Times New Roman" w:eastAsia="SimSun" w:cs="Times New Roman"/>
+          <w:b w:val="0"/>
+          <w:bCs w:val="0"/>
+          <w:i w:val="0"/>
+          <w:iCs w:val="0"/>
+          <w:sz w:val="28"/>
+          <w:szCs w:val="28"/>
+          <w:lang w:val="en-US"/>
+        </w:rPr>
+      </w:pPr>
+    </w:p>
+    <w:p>
+      <w:pPr>
+        <w:numPr>
+          <w:numId w:val="0"/>
+        </w:numPr>
+        <w:ind w:leftChars="0" w:firstLine="300" w:firstLineChars="150"/>
+        <w:jc w:val="both"/>
+        <w:rPr>
+          <w:rFonts w:hint="default" w:ascii="Times New Roman" w:hAnsi="Times New Roman" w:eastAsia="SimSun" w:cs="Times New Roman"/>
+          <w:b w:val="0"/>
+          <w:bCs w:val="0"/>
+          <w:i w:val="0"/>
+          <w:iCs w:val="0"/>
+          <w:sz w:val="28"/>
+          <w:szCs w:val="28"/>
+          <w:lang w:val="en-US"/>
+        </w:rPr>
+      </w:pPr>
+      <w:r>
+        <w:drawing>
+          <wp:anchor distT="0" distB="0" distL="114300" distR="114300" simplePos="0" relativeHeight="251660288" behindDoc="0" locked="0" layoutInCell="1" allowOverlap="1">
+            <wp:simplePos x="0" y="0"/>
+            <wp:positionH relativeFrom="column">
+              <wp:posOffset>1270</wp:posOffset>
+            </wp:positionH>
+            <wp:positionV relativeFrom="paragraph">
+              <wp:posOffset>2122170</wp:posOffset>
+            </wp:positionV>
+            <wp:extent cx="5271770" cy="4108450"/>
+            <wp:effectExtent l="0" t="0" r="1270" b="6350"/>
+            <wp:wrapSquare wrapText="bothSides"/>
+            <wp:docPr id="3" name="Picture 3"/>
+            <wp:cNvGraphicFramePr>
+              <a:graphicFrameLocks xmlns:a="http://schemas.openxmlformats.org/drawingml/2006/main" noChangeAspect="1"/>
+            </wp:cNvGraphicFramePr>
+            <a:graphic xmlns:a="http://schemas.openxmlformats.org/drawingml/2006/main">
+              <a:graphicData uri="http://schemas.openxmlformats.org/drawingml/2006/picture">
+                <pic:pic xmlns:pic="http://schemas.openxmlformats.org/drawingml/2006/picture">
+                  <pic:nvPicPr>
+                    <pic:cNvPr id="3" name="Picture 3"/>
+                    <pic:cNvPicPr>
+                      <a:picLocks noChangeAspect="1"/>
+                    </pic:cNvPicPr>
+                  </pic:nvPicPr>
+                  <pic:blipFill>
+                    <a:blip r:embed="rId4"/>
+                    <a:stretch>
+                      <a:fillRect/>
+                    </a:stretch>
+                  </pic:blipFill>
+                  <pic:spPr>
+                    <a:xfrm>
+                      <a:off x="0" y="0"/>
+                      <a:ext cx="5271770" cy="4108450"/>
+                    </a:xfrm>
+                    <a:prstGeom prst="rect">
+                      <a:avLst/>
+                    </a:prstGeom>
+                    <a:noFill/>
+                    <a:ln>
+                      <a:noFill/>
+                    </a:ln>
+                  </pic:spPr>
+                </pic:pic>
+              </a:graphicData>
+            </a:graphic>
+          </wp:anchor>
+        </w:drawing>
+      </w:r>
+      <w:r>
+        <w:drawing>
+          <wp:anchor distT="0" distB="0" distL="114300" distR="114300" simplePos="0" relativeHeight="251659264" behindDoc="0" locked="0" layoutInCell="1" allowOverlap="1">
+            <wp:simplePos x="0" y="0"/>
+            <wp:positionH relativeFrom="column">
+              <wp:posOffset>1905</wp:posOffset>
+            </wp:positionH>
+            <wp:positionV relativeFrom="paragraph">
+              <wp:posOffset>115570</wp:posOffset>
+            </wp:positionV>
+            <wp:extent cx="5271135" cy="1820545"/>
+            <wp:effectExtent l="0" t="0" r="1905" b="8255"/>
+            <wp:wrapSquare wrapText="bothSides"/>
+            <wp:docPr id="2" name="Picture 2"/>
+            <wp:cNvGraphicFramePr>
+              <a:graphicFrameLocks xmlns:a="http://schemas.openxmlformats.org/drawingml/2006/main" noChangeAspect="1"/>
+            </wp:cNvGraphicFramePr>
+            <a:graphic xmlns:a="http://schemas.openxmlformats.org/drawingml/2006/main">
+              <a:graphicData uri="http://schemas.openxmlformats.org/drawingml/2006/picture">
+                <pic:pic xmlns:pic="http://schemas.openxmlformats.org/drawingml/2006/picture">
+                  <pic:nvPicPr>
+                    <pic:cNvPr id="2" name="Picture 2"/>
+                    <pic:cNvPicPr>
+                      <a:picLocks noChangeAspect="1"/>
+                    </pic:cNvPicPr>
+                  </pic:nvPicPr>
+                  <pic:blipFill>
+                    <a:blip r:embed="rId5"/>
+                    <a:stretch>
+                      <a:fillRect/>
+                    </a:stretch>
+                  </pic:blipFill>
+                  <pic:spPr>
+                    <a:xfrm>
+                      <a:off x="0" y="0"/>
+                      <a:ext cx="5271135" cy="1820545"/>
+                    </a:xfrm>
+                    <a:prstGeom prst="rect">
+                      <a:avLst/>
+                    </a:prstGeom>
+                    <a:noFill/>
+                    <a:ln>
+                      <a:noFill/>
+                    </a:ln>
+                  </pic:spPr>
+                </pic:pic>
+              </a:graphicData>
+            </a:graphic>
+          </wp:anchor>
+        </w:drawing>
+      </w:r>
+    </w:p>
+    <w:p>
+      <w:pPr>
+        <w:numPr>
+          <w:numId w:val="0"/>
+        </w:numPr>
+        <w:ind w:leftChars="0" w:firstLine="420" w:firstLineChars="150"/>
+        <w:jc w:val="both"/>
+        <w:rPr>
+          <w:rFonts w:hint="default" w:ascii="Times New Roman" w:hAnsi="Times New Roman" w:eastAsia="SimSun" w:cs="Times New Roman"/>
+          <w:b w:val="0"/>
+          <w:bCs w:val="0"/>
+          <w:i w:val="0"/>
+          <w:iCs w:val="0"/>
+          <w:sz w:val="28"/>
+          <w:szCs w:val="28"/>
+          <w:lang w:val="en-US"/>
+        </w:rPr>
+      </w:pPr>
+    </w:p>
+    <w:p>
+      <w:pPr>
+        <w:numPr>
+          <w:numId w:val="0"/>
+        </w:numPr>
+        <w:ind w:leftChars="0" w:firstLine="420" w:firstLineChars="150"/>
+        <w:jc w:val="both"/>
+        <w:rPr>
+          <w:rFonts w:hint="default" w:ascii="Times New Roman" w:hAnsi="Times New Roman" w:eastAsia="SimSun" w:cs="Times New Roman"/>
+          <w:b w:val="0"/>
+          <w:bCs w:val="0"/>
+          <w:i w:val="0"/>
+          <w:iCs w:val="0"/>
+          <w:sz w:val="25"/>
+          <w:szCs w:val="25"/>
+          <w:lang w:val="en-US"/>
+        </w:rPr>
+      </w:pPr>
+      <w:r>
+        <w:rPr>
+          <w:rFonts w:hint="default" w:ascii="Times New Roman" w:hAnsi="Times New Roman" w:eastAsia="SimSun" w:cs="Times New Roman"/>
+          <w:b w:val="0"/>
+          <w:bCs w:val="0"/>
+          <w:i w:val="0"/>
+          <w:iCs w:val="0"/>
+          <w:sz w:val="28"/>
+          <w:szCs w:val="28"/>
+          <w:lang w:val="en-US"/>
+        </w:rPr>
+        <w:t xml:space="preserve"> </w:t>
+      </w:r>
+      <w:bookmarkStart w:id="0" w:name="_GoBack"/>
+      <w:bookmarkEnd w:id="0"/>
     </w:p>
     <w:sectPr>
       <w:pgSz w:w="11906" w:h="16838"/>

</xml_diff>